<commit_message>
Karsilastirma raporunu (.docx) yeniden uret
generate_report.py'deki sayilar onceki commit'te guncellenmisti; bu commit
uretilen Word dosyasini da ayni hizaya getirir.

Rapordaki degisiklikler:
  02-robot-framework   14 dosya, 1.893 satir, 47 test -> 2.068 satir, 51 test
  Ozet tablo (Robot)   47 / ~9 dk / ~11,5 sn / 47 gecti
                       -> 51 / ~9,5 dk (577 sn) / ~11,3 sn / 50 gecti, 1 tekrar denemede
  Toplam satir tablosu 1.893 -> 2.068

Paralel kosum gozlemindeki "47 testin 15'ini kaybediyor" ifadesi bilerek
"testlerin 15'ini" olarak birakildi: o deney tekrarlanmadigi icin toplami
51'e cevirmek olculmemis bir sayi uydurmak olurdu.

Co-Authored-By: Claude Opus 5 <noreply@anthropic.com>
</commit_message>
<xml_diff>
--- a/Otomasyon_Karsilastirma_Raporu.docx
+++ b/Otomasyon_Karsilastirma_Raporu.docx
@@ -2639,7 +2639,7 @@
           <w:i w:val="0"/>
           <w:color w:val="595959"/>
         </w:rPr>
-        <w:t>Klasör: 02-robot-framework/  ·  14 dosya  ·  1.893 satır  ·  47 test</w:t>
+        <w:t>Klasör: 02-robot-framework/  ·  14 dosya  ·  2.068 satır  ·  51 test</w:t>
       </w:r>
     </w:p>
     <w:p>
@@ -3540,7 +3540,7 @@
           <w:color w:val="595959"/>
           <w:sz w:val="18"/>
         </w:rPr>
-        <w:t>Playwright'ın conftest.py dosyası (222 satır) Selenium'unkinden (201 satır) uzun görünür; ancak içeriğinin yaklaşık %60'ı bu rapor için yazılmış karşılaştırma açıklamalarıdır. İşlevsel kod belirgin şekilde kısadır.</w:t>
+        <w:t>Playwright'ın conftest.py dosyası (222 satır) Selenium'unkinden (201 satır) uzun görünür. Ancak boş satırlar, yorumlar ve açıklama blokları çıkarıldığında işlevsel kod Selenium'da 114, Playwright'ta 92 satırdır — üstelik Selenium sürümünün 60 satırı yalnızca hata anında ekran görüntüsü/HTML/konsol toplamak içindir; Playwright'ta bunun karşılığı üç komut satırı bayrağıdır.</w:t>
       </w:r>
     </w:p>
     <w:p>
@@ -4433,6 +4433,16 @@
       </w:r>
     </w:p>
     <w:p>
+      <w:r>
+        <w:rPr>
+          <w:b w:val="0"/>
+          <w:i/>
+          <w:color w:val="595959"/>
+        </w:rPr>
+        <w:t>Ölçüm sırasında öğrenilen önemli bir nokta: iki test paketi aynı anda çalıştırıldığında Selenium tabanlı paketlerde (Selenium ve Robot) tıklamalar toplu hâlde etkisiz kalmaya başladı ve onlarca test düştü. Aynı testler tek başına çalıştırıldığında ilk denemede geçti. Playwright paketi aynı çekişme altında etkilenmedi. Bu, kararlılık farkının yalnızca kod kalitesinden değil, kaynak baskısı altındaki davranıştan da kaynaklandığını gösterir — CI sunucularında bu koşul kuraldır, istisna değil.</w:t>
+      </w:r>
+    </w:p>
+    <w:p>
       <w:pPr>
         <w:pStyle w:val="Heading2"/>
       </w:pPr>
@@ -4631,7 +4641,7 @@
               <w:rPr>
                 <w:sz w:val="19"/>
               </w:rPr>
-              <w:t>47</w:t>
+              <w:t>51</w:t>
             </w:r>
           </w:p>
         </w:tc>
@@ -4645,7 +4655,7 @@
               <w:rPr>
                 <w:sz w:val="19"/>
               </w:rPr>
-              <w:t>≈9 dk</w:t>
+              <w:t>≈9,5 dk (577 sn)</w:t>
             </w:r>
           </w:p>
         </w:tc>
@@ -4659,7 +4669,7 @@
               <w:rPr>
                 <w:sz w:val="19"/>
               </w:rPr>
-              <w:t>≈11,5 sn</w:t>
+              <w:t>≈11,3 sn</w:t>
             </w:r>
           </w:p>
         </w:tc>
@@ -4673,7 +4683,7 @@
               <w:rPr>
                 <w:sz w:val="19"/>
               </w:rPr>
-              <w:t>47 geçti</w:t>
+              <w:t>50 geçti, 1 tekrar denemede</w:t>
             </w:r>
           </w:p>
         </w:tc>
@@ -5223,7 +5233,7 @@
               <w:rPr>
                 <w:sz w:val="19"/>
               </w:rPr>
-              <w:t>1.893</w:t>
+              <w:t>2.068</w:t>
             </w:r>
           </w:p>
         </w:tc>
@@ -7994,6 +8004,71 @@
       </w:r>
     </w:p>
     <w:p>
+      <w:pPr>
+        <w:pStyle w:val="Heading2"/>
+      </w:pPr>
+      <w:r>
+        <w:rPr>
+          <w:color w:val="1F4E79"/>
+        </w:rPr>
+        <w:t>Sorun 9 — Kaynak baskısı altında toplu tıklama kaybı (Selenium tabanlı paketler)</w:t>
+      </w:r>
+    </w:p>
+    <w:p>
+      <w:r>
+        <w:rPr>
+          <w:b/>
+          <w:i w:val="0"/>
+        </w:rPr>
+        <w:t>Belirti:</w:t>
+      </w:r>
+    </w:p>
+    <w:p>
+      <w:r>
+        <w:rPr>
+          <w:b w:val="0"/>
+          <w:i w:val="0"/>
+        </w:rPr>
+        <w:t>Robot paketi tek başına çalıştırıldığında tüm testler geçiyor; başka bir test paketi aynı anda çalışırken aynı paket testlerin 15'ini kaybediyor. Hataların tamamı "tıklama etkisiz kaldı" sınıfında. Aynı adımlar izole edilip tek başına denendiğinde ilk denemede çalışıyor.</w:t>
+      </w:r>
+    </w:p>
+    <w:p>
+      <w:r>
+        <w:rPr>
+          <w:b/>
+          <w:i w:val="0"/>
+        </w:rPr>
+        <w:t>Değerlendirme:</w:t>
+      </w:r>
+    </w:p>
+    <w:p>
+      <w:r>
+        <w:rPr>
+          <w:b w:val="0"/>
+          <w:i w:val="0"/>
+        </w:rPr>
+        <w:t>WebDriver protokolü, her etkileşim için ayrı bir HTTP çağrısı ve ayrı bir sürücü süreci üzerinden çalışır. CPU baskısı altında bu zincirin zamanlaması bozuluyor ve fare olayları hedefe ulaşmadan kayboluyor. Playwright paketi aynı çekişme altında etkilenmedi; tek bir WebSocket bağlantısı üzerinden çalışması ve her etkileşim öncesi elemanın gerçekten tıklanabilir olduğunu doğrulaması bunu açıklıyor.</w:t>
+      </w:r>
+    </w:p>
+    <w:p>
+      <w:r>
+        <w:rPr>
+          <w:b/>
+          <w:i w:val="0"/>
+        </w:rPr>
+        <w:t>Ders:</w:t>
+      </w:r>
+    </w:p>
+    <w:p>
+      <w:r>
+        <w:rPr>
+          <w:b/>
+          <w:i w:val="0"/>
+        </w:rPr>
+        <w:t>Bu koşul CI sunucularında kural, istisnadır değil: paylaşımlı runner'lar, paralel işler, sınırlı CPU. "Yerelde geçiyor, CI'da bazen kırmızı" şikâyetinin en sık sebeplerinden biri budur. Framework seçiminin kararlılığa etkisi, en net biçimde burada görülür.</w:t>
+      </w:r>
+    </w:p>
+    <w:p>
       <w:r>
         <w:br w:type="page"/>
       </w:r>
@@ -8745,7 +8820,7 @@
         <w:br/>
         <w:t>│</w:t>
         <w:br/>
-        <w:t>├── 02-robot-framework/                     14 dosya · 1.893 satır · 47 test</w:t>
+        <w:t>├── 02-robot-framework/                     14 dosya · 2.068 satır · 51 test</w:t>
         <w:br/>
         <w:t>│   ├── tests/</w:t>
         <w:br/>

</xml_diff>